<commit_message>
Refonte du document de suivi client : fusion avec le script d'entrevue (positionnement, concurrence, modèle d'affaires)
Document exhaustif : les questions de fond (angle sans gluten vs boréal, concurrence, objectif unique du site) précèdent maintenant les champs de contenu, pour trancher le positionnement avant de finaliser le texte.
</commit_message>
<xml_diff>
--- a/informations-manquantes-borealesansgluten.docx
+++ b/informations-manquantes-borealesansgluten.docx
@@ -19,7 +19,7 @@
     </w:p>
     <w:p>
       <w:pPr>
-        <w:spacing w:after="260"/>
+        <w:spacing w:after="120"/>
       </w:pPr>
       <w:r>
         <w:rPr>
@@ -29,7 +29,7 @@
           <w:sz w:val="22"/>
           <w:szCs w:val="22"/>
         </w:rPr>
-        <w:t xml:space="preserve">Informations à confirmer pour compléter le site — à l'attention de Philippe Blais</w:t>
+        <w:t xml:space="preserve">Dossier complet — informations à confirmer pour finaliser le site — à l'attention de Philippe Blais</w:t>
       </w:r>
     </w:p>
     <w:p>
@@ -41,7 +41,7 @@
           <w:sz w:val="21"/>
           <w:szCs w:val="21"/>
         </w:rPr>
-        <w:t xml:space="preserve">Le site borealesansgluten.ca est en ligne dans sa structure et son contenu de base : les textes de vos publications Instagram, les photos que vous avez fournies et l'esprit « cuisine boréale, libre et sauvage » sont déjà intégrés. Il reste les éléments ci-dessous, qu'on ne pouvait pas deviner à votre place. Remplissez ce document (ou répondez par courriel) et le site sera mis à jour. Écrivez « à venir » si vous n'avez pas encore la réponse plutôt que de laisser une case vide.</w:t>
+        <w:t xml:space="preserve">Le site borealesansgluten.ca est en ligne : la structure, les textes tirés de vos publications Instagram et les photos que vous avez fournies y sont déjà. Ce document regroupe TOUT ce qu'il reste à confirmer ou à préciser — à la fois le contenu du site (courriel, tarifs, allergies, etc.) et les questions de fond sur le positionnement et le modèle d'affaires, pour que le site vende la bonne chose, à la bonne clientèle. Prenez le temps d'y répondre par écrit, ou utilisez-le comme aide-mémoire pour un appel — répondez par phrase complète plutôt que par un mot, et écrivez « à venir » plutôt que de laisser une case vide.</w:t>
       </w:r>
     </w:p>
     <w:p>
@@ -60,7 +60,117 @@
           <w:sz w:val="30"/>
           <w:szCs w:val="30"/>
         </w:rPr>
-        <w:t xml:space="preserve">1. Coordonnées et réservation</w:t>
+        <w:t xml:space="preserve">1. Modèle d'affaires et positionnement</w:t>
+      </w:r>
+    </w:p>
+    <w:p>
+      <w:pPr>
+        <w:spacing w:after="120"/>
+      </w:pPr>
+      <w:r>
+        <w:rPr>
+          <w:i/>
+          <w:iCs/>
+          <w:sz w:val="21"/>
+          <w:szCs w:val="21"/>
+        </w:rPr>
+        <w:t xml:space="preserve">Ces questions déterminent l'angle du site plus que son contenu — elles passent avant le reste : un site ne peut pas vendre "tout à tout le monde" et rester convaincant.</w:t>
+      </w:r>
+    </w:p>
+    <w:p>
+      <w:pPr>
+        <w:pStyle w:val="Heading2"/>
+        <w:spacing w:after="100" w:before="200"/>
+      </w:pPr>
+      <w:r>
+        <w:rPr>
+          <w:b/>
+          <w:bCs/>
+          <w:color w:val="A8703A"/>
+          <w:sz w:val="24"/>
+          <w:szCs w:val="24"/>
+        </w:rPr>
+        <w:t xml:space="preserve">1.1 Formule et tarification</w:t>
+      </w:r>
+    </w:p>
+    <w:p>
+      <w:pPr>
+        <w:spacing w:after="120"/>
+      </w:pPr>
+      <w:r>
+        <w:rPr>
+          <w:sz w:val="21"/>
+          <w:szCs w:val="21"/>
+        </w:rPr>
+        <w:t xml:space="preserve">Formule actuelle offerte :</w:t>
+      </w:r>
+    </w:p>
+    <w:p>
+      <w:pPr>
+        <w:pStyle w:val="ListParagraph"/>
+        <w:numPr>
+          <w:ilvl w:val="0"/>
+          <w:numId w:val="2"/>
+        </w:numPr>
+        <w:spacing w:after="90"/>
+      </w:pPr>
+      <w:r>
+        <w:rPr>
+          <w:sz w:val="21"/>
+          <w:szCs w:val="21"/>
+        </w:rPr>
+        <w:t xml:space="preserve">Forfait fixe par personne pour une soirée privée</w:t>
+      </w:r>
+    </w:p>
+    <w:p>
+      <w:pPr>
+        <w:pStyle w:val="ListParagraph"/>
+        <w:numPr>
+          <w:ilvl w:val="0"/>
+          <w:numId w:val="2"/>
+        </w:numPr>
+        <w:spacing w:after="90"/>
+      </w:pPr>
+      <w:r>
+        <w:rPr>
+          <w:sz w:val="21"/>
+          <w:szCs w:val="21"/>
+        </w:rPr>
+        <w:t xml:space="preserve">Menu dégustation à un nombre fixe de services</w:t>
+      </w:r>
+    </w:p>
+    <w:p>
+      <w:pPr>
+        <w:pStyle w:val="ListParagraph"/>
+        <w:numPr>
+          <w:ilvl w:val="0"/>
+          <w:numId w:val="2"/>
+        </w:numPr>
+        <w:spacing w:after="90"/>
+      </w:pPr>
+      <w:r>
+        <w:rPr>
+          <w:sz w:val="21"/>
+          <w:szCs w:val="21"/>
+        </w:rPr>
+        <w:t xml:space="preserve">Traiteur événementiel (réceptions, groupes)</w:t>
+      </w:r>
+    </w:p>
+    <w:p>
+      <w:pPr>
+        <w:pStyle w:val="ListParagraph"/>
+        <w:numPr>
+          <w:ilvl w:val="0"/>
+          <w:numId w:val="2"/>
+        </w:numPr>
+        <w:spacing w:after="90"/>
+      </w:pPr>
+      <w:r>
+        <w:rPr>
+          <w:sz w:val="21"/>
+          <w:szCs w:val="21"/>
+        </w:rPr>
+        <w:t xml:space="preserve">Plusieurs formules en parallèle (préciser lesquelles) : __________</w:t>
       </w:r>
     </w:p>
     <w:tbl>
@@ -133,7 +243,7 @@
                 <w:sz w:val="20"/>
                 <w:szCs w:val="20"/>
               </w:rPr>
-              <w:t xml:space="preserve">Courriel professionnel</w:t>
+              <w:t xml:space="preserve">Fourchette de prix actuelle</w:t>
             </w:r>
           </w:p>
         </w:tc>
@@ -150,7 +260,7 @@
                 <w:sz w:val="19"/>
                 <w:szCs w:val="19"/>
               </w:rPr>
-              <w:t xml:space="preserve">Utilisé pour recevoir les demandes du formulaire de contact (ex. contact@borealesansgluten.ca ou une adresse existante).</w:t>
+              <w:t xml:space="preserve">Par personne, ou par soirée — un chiffre ou une fourchette, même approximative.</w:t>
             </w:r>
           </w:p>
           <w:p/>
@@ -169,7 +279,7 @@
                 <w:sz w:val="20"/>
                 <w:szCs w:val="20"/>
               </w:rPr>
-              <w:t xml:space="preserve">Téléphone</w:t>
+              <w:t xml:space="preserve">Nombre de convives (min / max)</w:t>
             </w:r>
           </w:p>
         </w:tc>
@@ -186,7 +296,7 @@
                 <w:sz w:val="19"/>
                 <w:szCs w:val="19"/>
               </w:rPr>
-              <w:t xml:space="preserve">Affiché sur la page Contact. Laisser vide si vous préférez tout gérer par courriel.</w:t>
+              <w:t xml:space="preserve">Par soirée.</w:t>
             </w:r>
           </w:p>
           <w:p/>
@@ -205,7 +315,7 @@
                 <w:sz w:val="20"/>
                 <w:szCs w:val="20"/>
               </w:rPr>
-              <w:t xml:space="preserve">Zone desservie</w:t>
+              <w:t xml:space="preserve">Événements corporatifs</w:t>
             </w:r>
           </w:p>
         </w:tc>
@@ -222,7 +332,7 @@
                 <w:sz w:val="19"/>
                 <w:szCs w:val="19"/>
               </w:rPr>
-              <w:t xml:space="preserve">Ville de base et rayon de déplacement, ou liste de régions (ex. « Grand Québec, jusqu'à 45 min »).</w:t>
+              <w:t xml:space="preserve">Offerts en plus du privé, ou seulement les particuliers ?</w:t>
             </w:r>
           </w:p>
           <w:p/>
@@ -241,7 +351,7 @@
                 <w:sz w:val="20"/>
                 <w:szCs w:val="20"/>
               </w:rPr>
-              <w:t xml:space="preserve">Délai de réservation minimum</w:t>
+              <w:t xml:space="preserve">Cartes-cadeaux / forfaits spéciaux</w:t>
             </w:r>
           </w:p>
         </w:tc>
@@ -258,102 +368,39 @@
                 <w:sz w:val="19"/>
                 <w:szCs w:val="19"/>
               </w:rPr>
-              <w:t xml:space="preserve">Ex. « 2 semaines à l'avance » — affiché à l'étape 1 de « Comment ça marche ».</w:t>
+              <w:t xml:space="preserve">Saint-Valentin, temps des fêtes, etc. — en vend-il déjà, ou serait-ce à ajouter ?</w:t>
             </w:r>
           </w:p>
           <w:p/>
         </w:tc>
       </w:tr>
-      <w:tr>
-        <w:tc>
-          <w:tcPr>
-            <w:tcW w:type="dxa" w:w="3200"/>
-          </w:tcPr>
-          <w:p>
-            <w:r>
-              <w:rPr>
-                <w:b/>
-                <w:bCs/>
-                <w:sz w:val="20"/>
-                <w:szCs w:val="20"/>
-              </w:rPr>
-              <w:t xml:space="preserve">Nombre de convives (min / max)</w:t>
-            </w:r>
-          </w:p>
-        </w:tc>
-        <w:tc>
-          <w:tcPr>
-            <w:tcW w:type="dxa" w:w="6150"/>
-          </w:tcPr>
-          <w:p>
-            <w:r>
-              <w:rPr>
-                <w:i/>
-                <w:iCs/>
-                <w:color w:val="5B6660"/>
-                <w:sz w:val="19"/>
-                <w:szCs w:val="19"/>
-              </w:rPr>
-              <w:t xml:space="preserve">Ex. « de 2 à 12 personnes ».</w:t>
-            </w:r>
-          </w:p>
-          <w:p/>
-        </w:tc>
-      </w:tr>
-      <w:tr>
-        <w:tc>
-          <w:tcPr>
-            <w:tcW w:type="dxa" w:w="3200"/>
-          </w:tcPr>
-          <w:p>
-            <w:r>
-              <w:rPr>
-                <w:b/>
-                <w:bCs/>
-                <w:sz w:val="20"/>
-                <w:szCs w:val="20"/>
-              </w:rPr>
-              <w:t xml:space="preserve">Réseaux sociaux additionnels</w:t>
-            </w:r>
-          </w:p>
-        </w:tc>
-        <w:tc>
-          <w:tcPr>
-            <w:tcW w:type="dxa" w:w="6150"/>
-          </w:tcPr>
-          <w:p>
-            <w:r>
-              <w:rPr>
-                <w:i/>
-                <w:iCs/>
-                <w:color w:val="5B6660"/>
-                <w:sz w:val="19"/>
-                <w:szCs w:val="19"/>
-              </w:rPr>
-              <w:t xml:space="preserve">Facebook, TikTok, etc., si vous en utilisez en plus d'Instagram (@borealesansgluten déjà lié sur le site).</w:t>
-            </w:r>
-          </w:p>
-          <w:p/>
-        </w:tc>
-      </w:tr>
     </w:tbl>
     <w:p>
       <w:pPr>
-        <w:pStyle w:val="Heading1"/>
-        <w:pBdr>
-          <w:bottom w:val="single" w:color="A8703A" w:sz="6" w:space="4"/>
-        </w:pBdr>
-        <w:spacing w:after="160" w:before="320"/>
+        <w:spacing w:after="120"/>
+      </w:pPr>
+      <w:r>
+        <w:rPr>
+          <w:sz w:val="21"/>
+          <w:szCs w:val="21"/>
+        </w:rPr>
+        <w:t xml:space="preserve">Un dépôt ou acompte est-il demandé à la réservation ? Si oui, comment est-il perçu (virement Interac, autre) ?</w:t>
+      </w:r>
+    </w:p>
+    <w:p>
+      <w:pPr>
+        <w:pStyle w:val="Heading2"/>
+        <w:spacing w:after="100" w:before="200"/>
       </w:pPr>
       <w:r>
         <w:rPr>
           <w:b/>
           <w:bCs/>
-          <w:color w:val="12271F"/>
-          <w:sz w:val="30"/>
-          <w:szCs w:val="30"/>
-        </w:rPr>
-        <w:t xml:space="preserve">2. Tarification et formule</w:t>
+          <w:color w:val="A8703A"/>
+          <w:sz w:val="24"/>
+          <w:szCs w:val="24"/>
+        </w:rPr>
+        <w:t xml:space="preserve">1.2 Sans gluten ou cuisine boréale — quel est l'angle principal ?</w:t>
       </w:r>
     </w:p>
     <w:p>
@@ -365,7 +412,7 @@
           <w:sz w:val="21"/>
           <w:szCs w:val="21"/>
         </w:rPr>
-        <w:t xml:space="preserve">Le site ne mentionne actuellement aucun prix — c'est un choix par défaut, pas un oubli : aucun montant n'est jamais inventé sur un site qui sollicite des clients. Précisez la formule pour qu'on l'ajoute, ou confirmez que vous préférez garder « sur demande » partout.</w:t>
+        <w:t xml:space="preserve">Le compte Instagram s'appelle « borealsansgluten », mais les publications parlent presque uniquement de territoire et de saisons. Précisions à obtenir :</w:t>
       </w:r>
     </w:p>
     <w:p>
@@ -382,7 +429,7 @@
           <w:sz w:val="21"/>
           <w:szCs w:val="21"/>
         </w:rPr>
-        <w:t xml:space="preserve">Prix fixe par personne (indiquer le montant : __________)</w:t>
+        <w:t xml:space="preserve">Le sans gluten est un vrai argument de vente pour la clientèle (allergies, intolérances) — le mettre de l'avant</w:t>
       </w:r>
     </w:p>
     <w:p>
@@ -399,7 +446,7 @@
           <w:sz w:val="21"/>
           <w:szCs w:val="21"/>
         </w:rPr>
-        <w:t xml:space="preserve">Fourchette selon le menu (indiquer : __________)</w:t>
+        <w:t xml:space="preserve">Le sans gluten est surtout une contrainte personnelle/technique gérée en arrière-plan — le mentionner sans en faire le titre</w:t>
       </w:r>
     </w:p>
     <w:p>
@@ -416,7 +463,7 @@
           <w:sz w:val="21"/>
           <w:szCs w:val="21"/>
         </w:rPr>
-        <w:t xml:space="preserve">Sur demande uniquement, aucun prix affiché</w:t>
+        <w:t xml:space="preserve">Les deux sont d'égale importance</w:t>
       </w:r>
     </w:p>
     <w:p>
@@ -428,26 +475,37 @@
           <w:sz w:val="21"/>
           <w:szCs w:val="21"/>
         </w:rPr>
-        <w:t xml:space="preserve">Un dépôt ou acompte est-il demandé à la réservation ? Si oui, comment est-il perçu (virement Interac, autre) ? </w:t>
-      </w:r>
-    </w:p>
-    <w:p>
-      <w:pPr>
-        <w:pStyle w:val="Heading1"/>
-        <w:pBdr>
-          <w:bottom w:val="single" w:color="A8703A" w:sz="6" w:space="4"/>
-        </w:pBdr>
-        <w:spacing w:after="160" w:before="320"/>
+        <w:t xml:space="preserve">A-t-il déjà eu des clients qui l'ont choisi spécifiquement à cause du sans gluten (allergies, intolérances) ? Si oui, un exemple concret aiderait à rédiger le site.</w:t>
+      </w:r>
+    </w:p>
+    <w:p>
+      <w:pPr>
+        <w:spacing w:after="120"/>
       </w:pPr>
       <w:r>
         <w:rPr>
           <w:b/>
           <w:bCs/>
-          <w:color w:val="12271F"/>
-          <w:sz w:val="30"/>
-          <w:szCs w:val="30"/>
-        </w:rPr>
-        <w:t xml:space="preserve">3. Allergies et intolérances</w:t>
+          <w:sz w:val="21"/>
+          <w:szCs w:val="21"/>
+        </w:rPr>
+        <w:t xml:space="preserve">Si on devait retenir UN SEUL angle principal pour le site entre « gastronomie boréale » et « gastronomie boréale sans compromis, 100 % sans gluten » — lequel, et pourquoi ?</w:t>
+      </w:r>
+    </w:p>
+    <w:p>
+      <w:pPr>
+        <w:pStyle w:val="Heading2"/>
+        <w:spacing w:after="100" w:before="200"/>
+      </w:pPr>
+      <w:r>
+        <w:rPr>
+          <w:b/>
+          <w:bCs/>
+          <w:color w:val="A8703A"/>
+          <w:sz w:val="24"/>
+          <w:szCs w:val="24"/>
+        </w:rPr>
+        <w:t xml:space="preserve">1.3 Concurrence directe</w:t>
       </w:r>
     </w:p>
     <w:p>
@@ -459,7 +517,49 @@
           <w:sz w:val="21"/>
           <w:szCs w:val="21"/>
         </w:rPr>
-        <w:t xml:space="preserve">Le formulaire de contact ne recueille aucune information de santé — c'est volontaire et ne doit pas changer. Les allergies sont mentionnées comme étant discutées directement avec vous lors de la planification du menu.</w:t>
+        <w:t xml:space="preserve">Est-il au courant qu'« Un Cochon dans la Ville » à Québec offre un service très similaire (chef à domicile, cuisine boréale, produits du terroir) ?</w:t>
+      </w:r>
+    </w:p>
+    <w:p>
+      <w:pPr>
+        <w:spacing w:after="120"/>
+      </w:pPr>
+      <w:r>
+        <w:rPr>
+          <w:b/>
+          <w:bCs/>
+          <w:sz w:val="21"/>
+          <w:szCs w:val="21"/>
+        </w:rPr>
+        <w:t xml:space="preserve">Qu'est-ce qui le différencie concrètement d'eux et des autres chefs à domicile de la région ? Une réponse comme « ma passion » ou « mon authenticité » ne suffit pas pour un site web — il faut un fait vérifiable : une technique précise, une formation, la provenance exclusive d'un produit, un fournisseur exclusif, une méthode de cuisson particulière, etc.</w:t>
+      </w:r>
+    </w:p>
+    <w:p>
+      <w:pPr>
+        <w:pStyle w:val="Heading2"/>
+        <w:spacing w:after="100" w:before="200"/>
+      </w:pPr>
+      <w:r>
+        <w:rPr>
+          <w:b/>
+          <w:bCs/>
+          <w:color w:val="A8703A"/>
+          <w:sz w:val="24"/>
+          <w:szCs w:val="24"/>
+        </w:rPr>
+        <w:t xml:space="preserve">1.4 Objectif principal du site</w:t>
+      </w:r>
+    </w:p>
+    <w:p>
+      <w:pPr>
+        <w:spacing w:after="120"/>
+      </w:pPr>
+      <w:r>
+        <w:rPr>
+          <w:sz w:val="21"/>
+          <w:szCs w:val="21"/>
+        </w:rPr>
+        <w:t xml:space="preserve">Un site qui essaie de tout faire à la fois convainc moins qu'un site qui fait UNE chose très bien. À choisir :</w:t>
       </w:r>
     </w:p>
     <w:p>
@@ -476,7 +576,7 @@
           <w:sz w:val="21"/>
           <w:szCs w:val="21"/>
         </w:rPr>
-        <w:t xml:space="preserve">Je confirme que c'est la bonne façon de procéder (discussion verbale ou par courriel, hors formulaire web)</w:t>
+        <w:t xml:space="preserve">Réservation directe (formulaire ou calendrier en ligne)</w:t>
       </w:r>
     </w:p>
     <w:p>
@@ -493,7 +593,72 @@
           <w:sz w:val="21"/>
           <w:szCs w:val="21"/>
         </w:rPr>
-        <w:t xml:space="preserve">Je préfère une autre méthode (préciser) : __________</w:t>
+        <w:t xml:space="preserve">Générer des demandes de devis (aucun prix fixe affiché, contact obligatoire)</w:t>
+      </w:r>
+    </w:p>
+    <w:p>
+      <w:pPr>
+        <w:pStyle w:val="ListParagraph"/>
+        <w:numPr>
+          <w:ilvl w:val="0"/>
+          <w:numId w:val="2"/>
+        </w:numPr>
+        <w:spacing w:after="90"/>
+      </w:pPr>
+      <w:r>
+        <w:rPr>
+          <w:sz w:val="21"/>
+          <w:szCs w:val="21"/>
+        </w:rPr>
+        <w:t xml:space="preserve">Vitrine pour attirer la clientèle corporative / événementielle</w:t>
+      </w:r>
+    </w:p>
+    <w:p>
+      <w:pPr>
+        <w:pStyle w:val="ListParagraph"/>
+        <w:numPr>
+          <w:ilvl w:val="0"/>
+          <w:numId w:val="2"/>
+        </w:numPr>
+        <w:spacing w:after="90"/>
+      </w:pPr>
+      <w:r>
+        <w:rPr>
+          <w:sz w:val="21"/>
+          <w:szCs w:val="21"/>
+        </w:rPr>
+        <w:t xml:space="preserve">Vente de cartes-cadeaux</w:t>
+      </w:r>
+    </w:p>
+    <w:p>
+      <w:pPr>
+        <w:pStyle w:val="ListParagraph"/>
+        <w:numPr>
+          <w:ilvl w:val="0"/>
+          <w:numId w:val="2"/>
+        </w:numPr>
+        <w:spacing w:after="90"/>
+      </w:pPr>
+      <w:r>
+        <w:rPr>
+          <w:sz w:val="21"/>
+          <w:szCs w:val="21"/>
+        </w:rPr>
+        <w:t xml:space="preserve">Autre : __________</w:t>
+      </w:r>
+    </w:p>
+    <w:p>
+      <w:pPr>
+        <w:spacing w:after="120"/>
+      </w:pPr>
+      <w:r>
+        <w:rPr>
+          <w:b/>
+          <w:bCs/>
+          <w:sz w:val="21"/>
+          <w:szCs w:val="21"/>
+        </w:rPr>
+        <w:t xml:space="preserve">Question à trancher : si le site ne devait faire qu'UNE seule chose parfaitement, laquelle ?</w:t>
       </w:r>
     </w:p>
     <w:p>
@@ -512,19 +677,7 @@
           <w:sz w:val="30"/>
           <w:szCs w:val="30"/>
         </w:rPr>
-        <w:t xml:space="preserve">4. Le chef — page « Le chef »</w:t>
-      </w:r>
-    </w:p>
-    <w:p>
-      <w:pPr>
-        <w:spacing w:after="120"/>
-      </w:pPr>
-      <w:r>
-        <w:rPr>
-          <w:sz w:val="21"/>
-          <w:szCs w:val="21"/>
-        </w:rPr>
-        <w:t xml:space="preserve">La page reprend déjà vos mots (« trois ans à faire entrer dans les maisons une cuisine née du territoire... »). Pour l'étoffer :</w:t>
+        <w:t xml:space="preserve">2. Coordonnées, réservation et zone desservie</w:t>
       </w:r>
     </w:p>
     <w:tbl>
@@ -597,7 +750,7 @@
                 <w:sz w:val="20"/>
                 <w:szCs w:val="20"/>
               </w:rPr>
-              <w:t xml:space="preserve">Parcours avant Boréale sans gluten</w:t>
+              <w:t xml:space="preserve">Courriel professionnel</w:t>
             </w:r>
           </w:p>
         </w:tc>
@@ -614,7 +767,7 @@
                 <w:sz w:val="19"/>
                 <w:szCs w:val="19"/>
               </w:rPr>
-              <w:t xml:space="preserve">Formation, restaurants, expériences pertinentes — quelques lignes suffisent.</w:t>
+              <w:t xml:space="preserve">Utilisé pour recevoir les demandes du formulaire de contact (ex. contact@borealesansgluten.ca ou une adresse existante).</w:t>
             </w:r>
           </w:p>
           <w:p/>
@@ -633,7 +786,7 @@
                 <w:sz w:val="20"/>
                 <w:szCs w:val="20"/>
               </w:rPr>
-              <w:t xml:space="preserve">Photo supplémentaire du chef</w:t>
+              <w:t xml:space="preserve">Téléphone</w:t>
             </w:r>
           </w:p>
         </w:tc>
@@ -650,7 +803,223 @@
                 <w:sz w:val="19"/>
                 <w:szCs w:val="19"/>
               </w:rPr>
-              <w:t xml:space="preserve">Une photo de portrait plus posée, si vous en avez une, en plus des photos d'action déjà utilisées.</w:t>
+              <w:t xml:space="preserve">Affiché sur la page Contact. Laisser vide si vous préférez tout gérer par courriel.</w:t>
+            </w:r>
+          </w:p>
+          <w:p/>
+        </w:tc>
+      </w:tr>
+      <w:tr>
+        <w:tc>
+          <w:tcPr>
+            <w:tcW w:type="dxa" w:w="3200"/>
+          </w:tcPr>
+          <w:p>
+            <w:r>
+              <w:rPr>
+                <w:b/>
+                <w:bCs/>
+                <w:sz w:val="20"/>
+                <w:szCs w:val="20"/>
+              </w:rPr>
+              <w:t xml:space="preserve">Ville de base</w:t>
+            </w:r>
+          </w:p>
+        </w:tc>
+        <w:tc>
+          <w:tcPr>
+            <w:tcW w:type="dxa" w:w="6150"/>
+          </w:tcPr>
+          <w:p>
+            <w:r>
+              <w:rPr>
+                <w:i/>
+                <w:iCs/>
+                <w:color w:val="5B6660"/>
+                <w:sz w:val="19"/>
+                <w:szCs w:val="19"/>
+              </w:rPr>
+              <w:t xml:space="preserve">Ex. Québec.</w:t>
+            </w:r>
+          </w:p>
+          <w:p/>
+        </w:tc>
+      </w:tr>
+      <w:tr>
+        <w:tc>
+          <w:tcPr>
+            <w:tcW w:type="dxa" w:w="3200"/>
+          </w:tcPr>
+          <w:p>
+            <w:r>
+              <w:rPr>
+                <w:b/>
+                <w:bCs/>
+                <w:sz w:val="20"/>
+                <w:szCs w:val="20"/>
+              </w:rPr>
+              <w:t xml:space="preserve">Rayon de déplacement</w:t>
+            </w:r>
+          </w:p>
+        </w:tc>
+        <w:tc>
+          <w:tcPr>
+            <w:tcW w:type="dxa" w:w="6150"/>
+          </w:tcPr>
+          <w:p>
+            <w:r>
+              <w:rPr>
+                <w:i/>
+                <w:iCs/>
+                <w:color w:val="5B6660"/>
+                <w:sz w:val="19"/>
+                <w:szCs w:val="19"/>
+              </w:rPr>
+              <w:t xml:space="preserve">En km, ou liste de régions (ex. « jusqu'à 45 minutes de Québec »).</w:t>
+            </w:r>
+          </w:p>
+          <w:p/>
+        </w:tc>
+      </w:tr>
+      <w:tr>
+        <w:tc>
+          <w:tcPr>
+            <w:tcW w:type="dxa" w:w="3200"/>
+          </w:tcPr>
+          <w:p>
+            <w:r>
+              <w:rPr>
+                <w:b/>
+                <w:bCs/>
+                <w:sz w:val="20"/>
+                <w:szCs w:val="20"/>
+              </w:rPr>
+              <w:t xml:space="preserve">Déplacements hors zone</w:t>
+            </w:r>
+          </w:p>
+        </w:tc>
+        <w:tc>
+          <w:tcPr>
+            <w:tcW w:type="dxa" w:w="6150"/>
+          </w:tcPr>
+          <w:p>
+            <w:r>
+              <w:rPr>
+                <w:i/>
+                <w:iCs/>
+                <w:color w:val="5B6660"/>
+                <w:sz w:val="19"/>
+                <w:szCs w:val="19"/>
+              </w:rPr>
+              <w:t xml:space="preserve">Charlevoix, Saguenay, Lévis, etc. — moyennant supplément ? Préciser.</w:t>
+            </w:r>
+          </w:p>
+          <w:p/>
+        </w:tc>
+      </w:tr>
+      <w:tr>
+        <w:tc>
+          <w:tcPr>
+            <w:tcW w:type="dxa" w:w="3200"/>
+          </w:tcPr>
+          <w:p>
+            <w:r>
+              <w:rPr>
+                <w:b/>
+                <w:bCs/>
+                <w:sz w:val="20"/>
+                <w:szCs w:val="20"/>
+              </w:rPr>
+              <w:t xml:space="preserve">Afficher la zone pour le référencement local</w:t>
+            </w:r>
+          </w:p>
+        </w:tc>
+        <w:tc>
+          <w:tcPr>
+            <w:tcW w:type="dxa" w:w="6150"/>
+          </w:tcPr>
+          <w:p>
+            <w:r>
+              <w:rPr>
+                <w:i/>
+                <w:iCs/>
+                <w:color w:val="5B6660"/>
+                <w:sz w:val="19"/>
+                <w:szCs w:val="19"/>
+              </w:rPr>
+              <w:t xml:space="preserve">Oui/non — utile pour être trouvé dans les recherches Google "chef à domicile Québec".</w:t>
+            </w:r>
+          </w:p>
+          <w:p/>
+        </w:tc>
+      </w:tr>
+      <w:tr>
+        <w:tc>
+          <w:tcPr>
+            <w:tcW w:type="dxa" w:w="3200"/>
+          </w:tcPr>
+          <w:p>
+            <w:r>
+              <w:rPr>
+                <w:b/>
+                <w:bCs/>
+                <w:sz w:val="20"/>
+                <w:szCs w:val="20"/>
+              </w:rPr>
+              <w:t xml:space="preserve">Délai de réservation minimum</w:t>
+            </w:r>
+          </w:p>
+        </w:tc>
+        <w:tc>
+          <w:tcPr>
+            <w:tcW w:type="dxa" w:w="6150"/>
+          </w:tcPr>
+          <w:p>
+            <w:r>
+              <w:rPr>
+                <w:i/>
+                <w:iCs/>
+                <w:color w:val="5B6660"/>
+                <w:sz w:val="19"/>
+                <w:szCs w:val="19"/>
+              </w:rPr>
+              <w:t xml:space="preserve">Ex. « 2 semaines à l'avance ».</w:t>
+            </w:r>
+          </w:p>
+          <w:p/>
+        </w:tc>
+      </w:tr>
+      <w:tr>
+        <w:tc>
+          <w:tcPr>
+            <w:tcW w:type="dxa" w:w="3200"/>
+          </w:tcPr>
+          <w:p>
+            <w:r>
+              <w:rPr>
+                <w:b/>
+                <w:bCs/>
+                <w:sz w:val="20"/>
+                <w:szCs w:val="20"/>
+              </w:rPr>
+              <w:t xml:space="preserve">Réseaux sociaux additionnels</w:t>
+            </w:r>
+          </w:p>
+        </w:tc>
+        <w:tc>
+          <w:tcPr>
+            <w:tcW w:type="dxa" w:w="6150"/>
+          </w:tcPr>
+          <w:p>
+            <w:r>
+              <w:rPr>
+                <w:i/>
+                <w:iCs/>
+                <w:color w:val="5B6660"/>
+                <w:sz w:val="19"/>
+                <w:szCs w:val="19"/>
+              </w:rPr>
+              <w:t xml:space="preserve">Facebook, TikTok, etc., si utilisés en plus d'Instagram (@borealesansgluten déjà lié sur le site).</w:t>
             </w:r>
           </w:p>
           <w:p/>
@@ -673,7 +1042,7 @@
           <w:sz w:val="30"/>
           <w:szCs w:val="30"/>
         </w:rPr>
-        <w:t xml:space="preserve">5. Créations et menu</w:t>
+        <w:t xml:space="preserve">3. Allergies et intolérances</w:t>
       </w:r>
     </w:p>
     <w:p>
@@ -685,7 +1054,7 @@
           <w:sz w:val="21"/>
           <w:szCs w:val="21"/>
         </w:rPr>
-        <w:t xml:space="preserve">La liste des créations publiée sur le site est tirée de vos publications Instagram (betterave/chèvre, tataki de saumon, pieuvre grillée, etc.). Merci de confirmer qu'elle reste juste et à jour, ou d'indiquer les changements :</w:t>
+        <w:t xml:space="preserve">Le formulaire de contact ne recueille aucune information de santé — c'est volontaire et ne doit pas changer. Les allergies sont mentionnées comme étant discutées directement avec vous lors de la planification du menu.</w:t>
       </w:r>
     </w:p>
     <w:p>
@@ -702,7 +1071,7 @@
           <w:sz w:val="21"/>
           <w:szCs w:val="21"/>
         </w:rPr>
-        <w:t xml:space="preserve">La liste actuelle est bonne, aucun changement</w:t>
+        <w:t xml:space="preserve">Je confirme que c'est la bonne façon de procéder (discussion verbale ou par courriel, hors formulaire web)</w:t>
       </w:r>
     </w:p>
     <w:p>
@@ -719,36 +1088,7 @@
           <w:sz w:val="21"/>
           <w:szCs w:val="21"/>
         </w:rPr>
-        <w:t xml:space="preserve">Certains plats ne sont plus offerts (préciser) : __________</w:t>
-      </w:r>
-    </w:p>
-    <w:p>
-      <w:pPr>
-        <w:pStyle w:val="ListParagraph"/>
-        <w:numPr>
-          <w:ilvl w:val="0"/>
-          <w:numId w:val="2"/>
-        </w:numPr>
-        <w:spacing w:after="90"/>
-      </w:pPr>
-      <w:r>
-        <w:rPr>
-          <w:sz w:val="21"/>
-          <w:szCs w:val="21"/>
-        </w:rPr>
-        <w:t xml:space="preserve">Ajouter de nouvelles créations (préciser) : __________</w:t>
-      </w:r>
-    </w:p>
-    <w:p>
-      <w:pPr>
-        <w:spacing w:after="120"/>
-      </w:pPr>
-      <w:r>
-        <w:rPr>
-          <w:sz w:val="21"/>
-          <w:szCs w:val="21"/>
-        </w:rPr>
-        <w:t xml:space="preserve">Les photos utilisées proviennent de votre dossier personnel plutôt que d'une séance dédiée. Une séance photo professionnelle des assiettes serait-elle envisageable à moyen terme ?</w:t>
+        <w:t xml:space="preserve">Je préfère une autre méthode (préciser) : __________</w:t>
       </w:r>
     </w:p>
     <w:p>
@@ -767,7 +1107,19 @@
           <w:sz w:val="30"/>
           <w:szCs w:val="30"/>
         </w:rPr>
-        <w:t xml:space="preserve">6. Statut légal et facturation</w:t>
+        <w:t xml:space="preserve">4. Le chef — page « Le chef »</w:t>
+      </w:r>
+    </w:p>
+    <w:p>
+      <w:pPr>
+        <w:spacing w:after="120"/>
+      </w:pPr>
+      <w:r>
+        <w:rPr>
+          <w:sz w:val="21"/>
+          <w:szCs w:val="21"/>
+        </w:rPr>
+        <w:t xml:space="preserve">La page reprend déjà vos mots (« trois ans à faire entrer dans les maisons une cuisine née du territoire... »). Pour l'étoffer :</w:t>
       </w:r>
     </w:p>
     <w:tbl>
@@ -840,7 +1192,7 @@
                 <w:sz w:val="20"/>
                 <w:szCs w:val="20"/>
               </w:rPr>
-              <w:t xml:space="preserve">Nom légal de l'entreprise</w:t>
+              <w:t xml:space="preserve">Parcours avant Boréale sans gluten</w:t>
             </w:r>
           </w:p>
         </w:tc>
@@ -857,7 +1209,7 @@
                 <w:sz w:val="19"/>
                 <w:szCs w:val="19"/>
               </w:rPr>
-              <w:t xml:space="preserve">Tel qu'enregistré (travailleur autonome, inc., etc.), pour la fiche Google Business et les futurs documents.</w:t>
+              <w:t xml:space="preserve">Formation, restaurants, expériences pertinentes — quelques lignes suffisent.</w:t>
             </w:r>
           </w:p>
           <w:p/>
@@ -876,7 +1228,7 @@
                 <w:sz w:val="20"/>
                 <w:szCs w:val="20"/>
               </w:rPr>
-              <w:t xml:space="preserve">Numéro d'entreprise du Québec (NEQ)</w:t>
+              <w:t xml:space="preserve">Bio/histoire personnelle déjà écrite ailleurs ?</w:t>
             </w:r>
           </w:p>
         </w:tc>
@@ -893,7 +1245,79 @@
                 <w:sz w:val="19"/>
                 <w:szCs w:val="19"/>
               </w:rPr>
-              <w:t xml:space="preserve">Si applicable — non affiché publiquement, mais utile pour les démarches futures (fiche Google, etc.).</w:t>
+              <w:t xml:space="preserve">Si oui, où (à transmettre) ; sinon on la construit à partir de vos réponses ici.</w:t>
+            </w:r>
+          </w:p>
+          <w:p/>
+        </w:tc>
+      </w:tr>
+      <w:tr>
+        <w:tc>
+          <w:tcPr>
+            <w:tcW w:type="dxa" w:w="3200"/>
+          </w:tcPr>
+          <w:p>
+            <w:r>
+              <w:rPr>
+                <w:b/>
+                <w:bCs/>
+                <w:sz w:val="20"/>
+                <w:szCs w:val="20"/>
+              </w:rPr>
+              <w:t xml:space="preserve">Élément différenciateur vérifiable</w:t>
+            </w:r>
+          </w:p>
+        </w:tc>
+        <w:tc>
+          <w:tcPr>
+            <w:tcW w:type="dxa" w:w="6150"/>
+          </w:tcPr>
+          <w:p>
+            <w:r>
+              <w:rPr>
+                <w:i/>
+                <w:iCs/>
+                <w:color w:val="5B6660"/>
+                <w:sz w:val="19"/>
+                <w:szCs w:val="19"/>
+              </w:rPr>
+              <w:t xml:space="preserve">Voir section 1.3 — le fait précis qui vous distingue des autres chefs à domicile de la région.</w:t>
+            </w:r>
+          </w:p>
+          <w:p/>
+        </w:tc>
+      </w:tr>
+      <w:tr>
+        <w:tc>
+          <w:tcPr>
+            <w:tcW w:type="dxa" w:w="3200"/>
+          </w:tcPr>
+          <w:p>
+            <w:r>
+              <w:rPr>
+                <w:b/>
+                <w:bCs/>
+                <w:sz w:val="20"/>
+                <w:szCs w:val="20"/>
+              </w:rPr>
+              <w:t xml:space="preserve">Photo supplémentaire du chef</w:t>
+            </w:r>
+          </w:p>
+        </w:tc>
+        <w:tc>
+          <w:tcPr>
+            <w:tcW w:type="dxa" w:w="6150"/>
+          </w:tcPr>
+          <w:p>
+            <w:r>
+              <w:rPr>
+                <w:i/>
+                <w:iCs/>
+                <w:color w:val="5B6660"/>
+                <w:sz w:val="19"/>
+                <w:szCs w:val="19"/>
+              </w:rPr>
+              <w:t xml:space="preserve">Une photo de portrait plus posée, si vous en avez une, en plus des photos d'action déjà utilisées.</w:t>
             </w:r>
           </w:p>
           <w:p/>
@@ -916,7 +1340,7 @@
           <w:sz w:val="30"/>
           <w:szCs w:val="30"/>
         </w:rPr>
-        <w:t xml:space="preserve">7. Envoi des fichiers</w:t>
+        <w:t xml:space="preserve">5. Créations, menu et contenu existant</w:t>
       </w:r>
     </w:p>
     <w:p>
@@ -928,9 +1352,226 @@
           <w:sz w:val="21"/>
           <w:szCs w:val="21"/>
         </w:rPr>
-        <w:t xml:space="preserve">Si vous avez d'autres photos en haute résolution (plats, portraits, logo en plus haute définition que la version fournie), envoyez-les par courriel ou par lien de partage (Google Drive, WeTransfer) à Tony.</w:t>
-      </w:r>
-    </w:p>
+        <w:t xml:space="preserve">La liste des créations publiée sur le site est tirée de vos publications Instagram (betterave/chèvre, tataki de saumon, pieuvre grillée, etc.). Merci de confirmer qu'elle reste juste et à jour, ou d'indiquer les changements :</w:t>
+      </w:r>
+    </w:p>
+    <w:p>
+      <w:pPr>
+        <w:pStyle w:val="ListParagraph"/>
+        <w:numPr>
+          <w:ilvl w:val="0"/>
+          <w:numId w:val="2"/>
+        </w:numPr>
+        <w:spacing w:after="90"/>
+      </w:pPr>
+      <w:r>
+        <w:rPr>
+          <w:sz w:val="21"/>
+          <w:szCs w:val="21"/>
+        </w:rPr>
+        <w:t xml:space="preserve">La liste actuelle est bonne, aucun changement</w:t>
+      </w:r>
+    </w:p>
+    <w:p>
+      <w:pPr>
+        <w:pStyle w:val="ListParagraph"/>
+        <w:numPr>
+          <w:ilvl w:val="0"/>
+          <w:numId w:val="2"/>
+        </w:numPr>
+        <w:spacing w:after="90"/>
+      </w:pPr>
+      <w:r>
+        <w:rPr>
+          <w:sz w:val="21"/>
+          <w:szCs w:val="21"/>
+        </w:rPr>
+        <w:t xml:space="preserve">Certains plats ne sont plus offerts (préciser) : __________</w:t>
+      </w:r>
+    </w:p>
+    <w:p>
+      <w:pPr>
+        <w:pStyle w:val="ListParagraph"/>
+        <w:numPr>
+          <w:ilvl w:val="0"/>
+          <w:numId w:val="2"/>
+        </w:numPr>
+        <w:spacing w:after="90"/>
+      </w:pPr>
+      <w:r>
+        <w:rPr>
+          <w:sz w:val="21"/>
+          <w:szCs w:val="21"/>
+        </w:rPr>
+        <w:t xml:space="preserve">Ajouter de nouvelles créations (préciser) : __________</w:t>
+      </w:r>
+    </w:p>
+    <w:tbl>
+      <w:tblPr>
+        <w:tblW w:type="dxa" w:w="9350"/>
+        <w:tblBorders>
+          <w:top w:val="single" w:color="auto" w:sz="4"/>
+          <w:left w:val="single" w:color="auto" w:sz="4"/>
+          <w:bottom w:val="single" w:color="auto" w:sz="4"/>
+          <w:right w:val="single" w:color="auto" w:sz="4"/>
+          <w:insideH w:val="single" w:color="auto" w:sz="4"/>
+          <w:insideV w:val="single" w:color="auto" w:sz="4"/>
+        </w:tblBorders>
+      </w:tblPr>
+      <w:tblGrid>
+        <w:gridCol w:w="3200"/>
+        <w:gridCol w:w="6150"/>
+      </w:tblGrid>
+      <w:tr>
+        <w:trPr>
+          <w:tblHeader/>
+        </w:trPr>
+        <w:tc>
+          <w:tcPr>
+            <w:tcW w:type="dxa" w:w="3200"/>
+            <w:shd w:fill="A8703A" w:val="clear"/>
+          </w:tcPr>
+          <w:p>
+            <w:r>
+              <w:rPr>
+                <w:b/>
+                <w:bCs/>
+                <w:color w:val="FFFFFF"/>
+                <w:sz w:val="20"/>
+                <w:szCs w:val="20"/>
+              </w:rPr>
+              <w:t xml:space="preserve">Élément demandé</w:t>
+            </w:r>
+          </w:p>
+        </w:tc>
+        <w:tc>
+          <w:tcPr>
+            <w:tcW w:type="dxa" w:w="6150"/>
+            <w:shd w:fill="A8703A" w:val="clear"/>
+          </w:tcPr>
+          <w:p>
+            <w:r>
+              <w:rPr>
+                <w:b/>
+                <w:bCs/>
+                <w:color w:val="FFFFFF"/>
+                <w:sz w:val="20"/>
+                <w:szCs w:val="20"/>
+              </w:rPr>
+              <w:t xml:space="preserve">Votre réponse</w:t>
+            </w:r>
+          </w:p>
+        </w:tc>
+      </w:tr>
+      <w:tr>
+        <w:tc>
+          <w:tcPr>
+            <w:tcW w:type="dxa" w:w="3200"/>
+          </w:tcPr>
+          <w:p>
+            <w:r>
+              <w:rPr>
+                <w:b/>
+                <w:bCs/>
+                <w:sz w:val="20"/>
+                <w:szCs w:val="20"/>
+              </w:rPr>
+              <w:t xml:space="preserve">Menus-types déjà rédigés ?</w:t>
+            </w:r>
+          </w:p>
+        </w:tc>
+        <w:tc>
+          <w:tcPr>
+            <w:tcW w:type="dxa" w:w="6150"/>
+          </w:tcPr>
+          <w:p>
+            <w:r>
+              <w:rPr>
+                <w:i/>
+                <w:iCs/>
+                <w:color w:val="5B6660"/>
+                <w:sz w:val="19"/>
+                <w:szCs w:val="19"/>
+              </w:rPr>
+              <w:t xml:space="preserve">Ou tout est composé sur mesure à chaque fois, sans menu fixe ?</w:t>
+            </w:r>
+          </w:p>
+          <w:p/>
+        </w:tc>
+      </w:tr>
+      <w:tr>
+        <w:tc>
+          <w:tcPr>
+            <w:tcW w:type="dxa" w:w="3200"/>
+          </w:tcPr>
+          <w:p>
+            <w:r>
+              <w:rPr>
+                <w:b/>
+                <w:bCs/>
+                <w:sz w:val="20"/>
+                <w:szCs w:val="20"/>
+              </w:rPr>
+              <w:t xml:space="preserve">Photos professionnelles haute résolution</w:t>
+            </w:r>
+          </w:p>
+        </w:tc>
+        <w:tc>
+          <w:tcPr>
+            <w:tcW w:type="dxa" w:w="6150"/>
+          </w:tcPr>
+          <w:p>
+            <w:r>
+              <w:rPr>
+                <w:i/>
+                <w:iCs/>
+                <w:color w:val="5B6660"/>
+                <w:sz w:val="19"/>
+                <w:szCs w:val="19"/>
+              </w:rPr>
+              <w:t xml:space="preserve">Distinctes des exports Instagram compressés actuellement utilisés — en avez-vous ?</w:t>
+            </w:r>
+          </w:p>
+          <w:p/>
+        </w:tc>
+      </w:tr>
+      <w:tr>
+        <w:tc>
+          <w:tcPr>
+            <w:tcW w:type="dxa" w:w="3200"/>
+          </w:tcPr>
+          <w:p>
+            <w:r>
+              <w:rPr>
+                <w:b/>
+                <w:bCs/>
+                <w:sz w:val="20"/>
+                <w:szCs w:val="20"/>
+              </w:rPr>
+              <w:t xml:space="preserve">Témoignages ou avis clients</w:t>
+            </w:r>
+          </w:p>
+        </w:tc>
+        <w:tc>
+          <w:tcPr>
+            <w:tcW w:type="dxa" w:w="6150"/>
+          </w:tcPr>
+          <w:p>
+            <w:r>
+              <w:rPr>
+                <w:i/>
+                <w:iCs/>
+                <w:color w:val="5B6660"/>
+                <w:sz w:val="19"/>
+                <w:szCs w:val="19"/>
+              </w:rPr>
+              <w:t xml:space="preserve">Google, Instagram, textos de clients satisfaits — même informels, ils peuvent être cités (avec permission).</w:t>
+            </w:r>
+          </w:p>
+          <w:p/>
+        </w:tc>
+      </w:tr>
+    </w:tbl>
     <w:p>
       <w:pPr>
         <w:spacing w:after="120"/>
@@ -940,7 +1581,7 @@
           <w:sz w:val="21"/>
           <w:szCs w:val="21"/>
         </w:rPr>
-        <w:t xml:space="preserve">Photos déjà reçues et utilisées : logo, 2 photos d'action en cuisine, 6 photos de plats. Toute nouvelle photo remplace ou complète celles-ci sans frais additionnel de développement.</w:t>
+        <w:t xml:space="preserve">Une séance photo professionnelle des assiettes serait-elle envisageable à moyen terme ? Les photos actuelles proviennent de votre dossier personnel plutôt que d'une séance dédiée.</w:t>
       </w:r>
     </w:p>
     <w:p>
@@ -959,7 +1600,58 @@
           <w:sz w:val="30"/>
           <w:szCs w:val="30"/>
         </w:rPr>
-        <w:t xml:space="preserve">8. Prochaines étapes techniques (rien à faire de votre côté)</w:t>
+        <w:t xml:space="preserve">6. Contenu rédactionnel — qui écrit, et sur quel ton</w:t>
+      </w:r>
+    </w:p>
+    <w:p>
+      <w:pPr>
+        <w:pStyle w:val="ListParagraph"/>
+        <w:numPr>
+          <w:ilvl w:val="0"/>
+          <w:numId w:val="2"/>
+        </w:numPr>
+        <w:spacing w:after="90"/>
+      </w:pPr>
+      <w:r>
+        <w:rPr>
+          <w:sz w:val="21"/>
+          <w:szCs w:val="21"/>
+        </w:rPr>
+        <w:t xml:space="preserve">Adapter vos publications Instagram existantes (ton actuel : « Je cuisine ce qui pousse ici... »)</w:t>
+      </w:r>
+    </w:p>
+    <w:p>
+      <w:pPr>
+        <w:pStyle w:val="ListParagraph"/>
+        <w:numPr>
+          <w:ilvl w:val="0"/>
+          <w:numId w:val="2"/>
+        </w:numPr>
+        <w:spacing w:after="90"/>
+      </w:pPr>
+      <w:r>
+        <w:rPr>
+          <w:sz w:val="21"/>
+          <w:szCs w:val="21"/>
+        </w:rPr>
+        <w:t xml:space="preserve">Rédiger du contenu neuf, en français plus soutenu / premium</w:t>
+      </w:r>
+    </w:p>
+    <w:p>
+      <w:pPr>
+        <w:pStyle w:val="ListParagraph"/>
+        <w:numPr>
+          <w:ilvl w:val="0"/>
+          <w:numId w:val="2"/>
+        </w:numPr>
+        <w:spacing w:after="90"/>
+      </w:pPr>
+      <w:r>
+        <w:rPr>
+          <w:sz w:val="21"/>
+          <w:szCs w:val="21"/>
+        </w:rPr>
+        <w:t xml:space="preserve">Mélange des deux selon les pages</w:t>
       </w:r>
     </w:p>
     <w:p>
@@ -971,7 +1663,314 @@
           <w:sz w:val="21"/>
           <w:szCs w:val="21"/>
         </w:rPr>
-        <w:t xml:space="preserve">Ces éléments sont gérés par Tony : mise en ligne finale sur borealesansgluten.ca, connexion du formulaire de contact, courriel professionnel, fiche Google Business, et référencement de base. Vous serez avisé une fois chaque étape complétée.</w:t>
+        <w:t xml:space="preserve">Le ton actuel, chaleureux et personnel, doit-il être gardé tel quel sur le site, ou préférez-vous quelque chose de plus sobre pour l'aspect "vitrine professionnelle" ?</w:t>
+      </w:r>
+    </w:p>
+    <w:p>
+      <w:pPr>
+        <w:pStyle w:val="Heading1"/>
+        <w:pBdr>
+          <w:bottom w:val="single" w:color="A8703A" w:sz="6" w:space="4"/>
+        </w:pBdr>
+        <w:spacing w:after="160" w:before="320"/>
+      </w:pPr>
+      <w:r>
+        <w:rPr>
+          <w:b/>
+          <w:bCs/>
+          <w:color w:val="12271F"/>
+          <w:sz w:val="30"/>
+          <w:szCs w:val="30"/>
+        </w:rPr>
+        <w:t xml:space="preserve">7. Statut légal, facturation et contraintes pratiques</w:t>
+      </w:r>
+    </w:p>
+    <w:tbl>
+      <w:tblPr>
+        <w:tblW w:type="dxa" w:w="9350"/>
+        <w:tblBorders>
+          <w:top w:val="single" w:color="auto" w:sz="4"/>
+          <w:left w:val="single" w:color="auto" w:sz="4"/>
+          <w:bottom w:val="single" w:color="auto" w:sz="4"/>
+          <w:right w:val="single" w:color="auto" w:sz="4"/>
+          <w:insideH w:val="single" w:color="auto" w:sz="4"/>
+          <w:insideV w:val="single" w:color="auto" w:sz="4"/>
+        </w:tblBorders>
+      </w:tblPr>
+      <w:tblGrid>
+        <w:gridCol w:w="3200"/>
+        <w:gridCol w:w="6150"/>
+      </w:tblGrid>
+      <w:tr>
+        <w:trPr>
+          <w:tblHeader/>
+        </w:trPr>
+        <w:tc>
+          <w:tcPr>
+            <w:tcW w:type="dxa" w:w="3200"/>
+            <w:shd w:fill="A8703A" w:val="clear"/>
+          </w:tcPr>
+          <w:p>
+            <w:r>
+              <w:rPr>
+                <w:b/>
+                <w:bCs/>
+                <w:color w:val="FFFFFF"/>
+                <w:sz w:val="20"/>
+                <w:szCs w:val="20"/>
+              </w:rPr>
+              <w:t xml:space="preserve">Élément demandé</w:t>
+            </w:r>
+          </w:p>
+        </w:tc>
+        <w:tc>
+          <w:tcPr>
+            <w:tcW w:type="dxa" w:w="6150"/>
+            <w:shd w:fill="A8703A" w:val="clear"/>
+          </w:tcPr>
+          <w:p>
+            <w:r>
+              <w:rPr>
+                <w:b/>
+                <w:bCs/>
+                <w:color w:val="FFFFFF"/>
+                <w:sz w:val="20"/>
+                <w:szCs w:val="20"/>
+              </w:rPr>
+              <w:t xml:space="preserve">Votre réponse</w:t>
+            </w:r>
+          </w:p>
+        </w:tc>
+      </w:tr>
+      <w:tr>
+        <w:tc>
+          <w:tcPr>
+            <w:tcW w:type="dxa" w:w="3200"/>
+          </w:tcPr>
+          <w:p>
+            <w:r>
+              <w:rPr>
+                <w:b/>
+                <w:bCs/>
+                <w:sz w:val="20"/>
+                <w:szCs w:val="20"/>
+              </w:rPr>
+              <w:t xml:space="preserve">Nom légal de l'entreprise</w:t>
+            </w:r>
+          </w:p>
+        </w:tc>
+        <w:tc>
+          <w:tcPr>
+            <w:tcW w:type="dxa" w:w="6150"/>
+          </w:tcPr>
+          <w:p>
+            <w:r>
+              <w:rPr>
+                <w:i/>
+                <w:iCs/>
+                <w:color w:val="5B6660"/>
+                <w:sz w:val="19"/>
+                <w:szCs w:val="19"/>
+              </w:rPr>
+              <w:t xml:space="preserve">Tel qu'enregistré (travailleur autonome, inc., etc.), pour la fiche Google Business et les futurs documents.</w:t>
+            </w:r>
+          </w:p>
+          <w:p/>
+        </w:tc>
+      </w:tr>
+      <w:tr>
+        <w:tc>
+          <w:tcPr>
+            <w:tcW w:type="dxa" w:w="3200"/>
+          </w:tcPr>
+          <w:p>
+            <w:r>
+              <w:rPr>
+                <w:b/>
+                <w:bCs/>
+                <w:sz w:val="20"/>
+                <w:szCs w:val="20"/>
+              </w:rPr>
+              <w:t xml:space="preserve">Numéro d'entreprise du Québec (NEQ)</w:t>
+            </w:r>
+          </w:p>
+        </w:tc>
+        <w:tc>
+          <w:tcPr>
+            <w:tcW w:type="dxa" w:w="6150"/>
+          </w:tcPr>
+          <w:p>
+            <w:r>
+              <w:rPr>
+                <w:i/>
+                <w:iCs/>
+                <w:color w:val="5B6660"/>
+                <w:sz w:val="19"/>
+                <w:szCs w:val="19"/>
+              </w:rPr>
+              <w:t xml:space="preserve">Si applicable — non affiché publiquement, mais utile pour les démarches futures (fiche Google, etc.).</w:t>
+            </w:r>
+          </w:p>
+          <w:p/>
+        </w:tc>
+      </w:tr>
+      <w:tr>
+        <w:tc>
+          <w:tcPr>
+            <w:tcW w:type="dxa" w:w="3200"/>
+          </w:tcPr>
+          <w:p>
+            <w:r>
+              <w:rPr>
+                <w:b/>
+                <w:bCs/>
+                <w:sz w:val="20"/>
+                <w:szCs w:val="20"/>
+              </w:rPr>
+              <w:t xml:space="preserve">Budget annuel approximatif</w:t>
+            </w:r>
+          </w:p>
+        </w:tc>
+        <w:tc>
+          <w:tcPr>
+            <w:tcW w:type="dxa" w:w="6150"/>
+          </w:tcPr>
+          <w:p>
+            <w:r>
+              <w:rPr>
+                <w:i/>
+                <w:iCs/>
+                <w:color w:val="5B6660"/>
+                <w:sz w:val="19"/>
+                <w:szCs w:val="19"/>
+              </w:rPr>
+              <w:t xml:space="preserve">Hébergement/domaine — pour référence ; le site actuel est déjà hébergé sans frais récurrents côté Cloudflare, mais bon à documenter pour vos prévisions.</w:t>
+            </w:r>
+          </w:p>
+          <w:p/>
+        </w:tc>
+      </w:tr>
+      <w:tr>
+        <w:tc>
+          <w:tcPr>
+            <w:tcW w:type="dxa" w:w="3200"/>
+          </w:tcPr>
+          <w:p>
+            <w:r>
+              <w:rPr>
+                <w:b/>
+                <w:bCs/>
+                <w:sz w:val="20"/>
+                <w:szCs w:val="20"/>
+              </w:rPr>
+              <w:t xml:space="preserve">Délai visé pour la mise en ligne complète</w:t>
+            </w:r>
+          </w:p>
+        </w:tc>
+        <w:tc>
+          <w:tcPr>
+            <w:tcW w:type="dxa" w:w="6150"/>
+          </w:tcPr>
+          <w:p>
+            <w:r>
+              <w:rPr>
+                <w:i/>
+                <w:iCs/>
+                <w:color w:val="5B6660"/>
+                <w:sz w:val="19"/>
+                <w:szCs w:val="19"/>
+              </w:rPr>
+              <w:t xml:space="preserve">Le site technique est déjà en ligne ; ceci concerne la version finalisée avec tout le contenu confirmé.</w:t>
+            </w:r>
+          </w:p>
+          <w:p/>
+        </w:tc>
+      </w:tr>
+    </w:tbl>
+    <w:p>
+      <w:pPr>
+        <w:spacing w:after="120"/>
+      </w:pPr>
+      <w:r>
+        <w:rPr>
+          <w:sz w:val="21"/>
+          <w:szCs w:val="21"/>
+        </w:rPr>
+        <w:t xml:space="preserve">Êtes-vous à l'aise avec le fait qu'un formulaire de contact = collecte de données personnelles, donc une obligation d'avoir une politique de confidentialité (Loi 25) ? Un brouillon est déjà en place sur le site (à faire réviser par un juriste avant publication définitive) — juste à confirmer que vous comprenez cette obligation légale.</w:t>
+      </w:r>
+    </w:p>
+    <w:p>
+      <w:pPr>
+        <w:pStyle w:val="Heading1"/>
+        <w:pBdr>
+          <w:bottom w:val="single" w:color="A8703A" w:sz="6" w:space="4"/>
+        </w:pBdr>
+        <w:spacing w:after="160" w:before="320"/>
+      </w:pPr>
+      <w:r>
+        <w:rPr>
+          <w:b/>
+          <w:bCs/>
+          <w:color w:val="12271F"/>
+          <w:sz w:val="30"/>
+          <w:szCs w:val="30"/>
+        </w:rPr>
+        <w:t xml:space="preserve">8. Envoi des fichiers</w:t>
+      </w:r>
+    </w:p>
+    <w:p>
+      <w:pPr>
+        <w:spacing w:after="120"/>
+      </w:pPr>
+      <w:r>
+        <w:rPr>
+          <w:sz w:val="21"/>
+          <w:szCs w:val="21"/>
+        </w:rPr>
+        <w:t xml:space="preserve">Si vous avez d'autres photos en haute résolution (plats, portraits, logo en plus haute définition que la version fournie), envoyez-les par courriel ou par lien de partage (Google Drive, WeTransfer) à Tony.</w:t>
+      </w:r>
+    </w:p>
+    <w:p>
+      <w:pPr>
+        <w:spacing w:after="120"/>
+      </w:pPr>
+      <w:r>
+        <w:rPr>
+          <w:sz w:val="21"/>
+          <w:szCs w:val="21"/>
+        </w:rPr>
+        <w:t xml:space="preserve">Photos déjà reçues et utilisées : logo, 2 photos d'action en cuisine, 6 photos de plats. Toute nouvelle photo remplace ou complète celles-ci sans frais additionnel de développement.</w:t>
+      </w:r>
+    </w:p>
+    <w:p>
+      <w:pPr>
+        <w:pStyle w:val="Heading1"/>
+        <w:pBdr>
+          <w:bottom w:val="single" w:color="A8703A" w:sz="6" w:space="4"/>
+        </w:pBdr>
+        <w:spacing w:after="160" w:before="320"/>
+      </w:pPr>
+      <w:r>
+        <w:rPr>
+          <w:b/>
+          <w:bCs/>
+          <w:color w:val="12271F"/>
+          <w:sz w:val="30"/>
+          <w:szCs w:val="30"/>
+        </w:rPr>
+        <w:t xml:space="preserve">9. Prochaines étapes techniques (rien à faire de votre côté)</w:t>
+      </w:r>
+    </w:p>
+    <w:p>
+      <w:pPr>
+        <w:spacing w:after="120"/>
+      </w:pPr>
+      <w:r>
+        <w:rPr>
+          <w:sz w:val="21"/>
+          <w:szCs w:val="21"/>
+        </w:rPr>
+        <w:t xml:space="preserve">Le site est déjà en ligne sur boréalesansgluten.ca (et www.boréalesansgluten.ca), avec déploiement automatique : chaque mise à jour de contenu est republiée sans intervention manuelle. Restent à faire, une fois vos réponses reçues : connexion du vrai courriel au formulaire de contact, courriel professionnel, fiche Google Business, et référencement de base. Vous serez avisé une fois chaque étape complétée.</w:t>
       </w:r>
     </w:p>
     <w:p>
@@ -994,7 +1993,7 @@
           <w:sz w:val="18"/>
           <w:szCs w:val="18"/>
         </w:rPr>
-        <w:t xml:space="preserve">Document préparé le 3 septembre 2026. Des questions ? Répondez directement à Tony.</w:t>
+        <w:t xml:space="preserve">Document préparé le 4 septembre 2026, mis à jour à partir du script d'entrevue client. Des questions ? Répondez directement à Tony.</w:t>
       </w:r>
     </w:p>
     <w:sectPr>

</xml_diff>